<commit_message>
CV: add agentic TS forecasting to research interests and LG AI Research tasks
Co-Authored-By: Claude Opus 5 (1M context) <noreply@anthropic.com>
</commit_message>
<xml_diff>
--- a/SeunghanLee_CV.docx
+++ b/SeunghanLee_CV.docx
@@ -1343,6 +1343,32 @@
           <w:sz w:val="24"/>
           <w:u w:val="none"/>
         </w:rPr>
+        <w:t>Agentic Time Series Forecasting</w:t>
+      </w:r>
+    </w:p>
+    <w:p>
+      <w:pPr>
+        <w:spacing w:before="0" w:after="0"/>
+        <w:ind w:left="850" w:hanging="255"/>
+      </w:pPr>
+      <w:r>
+        <w:rPr>
+          <w:rFonts w:ascii="Gulim" w:hAnsi="Gulim" w:eastAsia="Gulim"/>
+          <w:b w:val="0"/>
+          <w:i w:val="0"/>
+          <w:sz w:val="24"/>
+          <w:u w:val="none"/>
+        </w:rPr>
+        <w:t xml:space="preserve">o  </w:t>
+      </w:r>
+      <w:r>
+        <w:rPr>
+          <w:rFonts w:ascii="Gulim" w:hAnsi="Gulim" w:eastAsia="Gulim"/>
+          <w:b w:val="0"/>
+          <w:i w:val="0"/>
+          <w:sz w:val="24"/>
+          <w:u w:val="none"/>
+        </w:rPr>
         <w:t>Time Series Foundation Models</w:t>
       </w:r>
     </w:p>
@@ -3578,7 +3604,7 @@
     </w:p>
     <w:p>
       <w:pPr>
-        <w:spacing w:before="0" w:after="200"/>
+        <w:spacing w:before="0" w:after="60"/>
       </w:pPr>
       <w:r>
         <w:rPr>
@@ -3851,43 +3877,33 @@
           <w:sz w:val="24"/>
           <w:u w:val="none"/>
         </w:rPr>
-        <w:t>④ Supply Chain Knowledge Graph</w:t>
+        <w:t>④ Agentic TS forecasting</w:t>
       </w:r>
     </w:p>
     <w:p>
       <w:pPr>
         <w:spacing w:before="0" w:after="0"/>
-        <w:ind w:left="425" w:hanging="255"/>
-      </w:pPr>
-      <w:r>
-        <w:rPr>
-          <w:rFonts w:ascii="Gulim" w:hAnsi="Gulim" w:eastAsia="Gulim"/>
-          <w:b w:val="0"/>
-          <w:i w:val="0"/>
-          <w:sz w:val="24"/>
-          <w:u w:val="none"/>
-        </w:rPr>
-        <w:t xml:space="preserve">• </w:t>
-      </w:r>
-      <w:r>
-        <w:rPr>
-          <w:rFonts w:ascii="Gulim" w:hAnsi="Gulim" w:eastAsia="Gulim"/>
-          <w:b/>
-          <w:i w:val="0"/>
-          <w:sz w:val="24"/>
-          <w:u w:val="none"/>
-        </w:rPr>
-        <w:t>Key Algorithms</w:t>
-      </w:r>
-      <w:r>
-        <w:rPr>
-          <w:rFonts w:ascii="Gulim" w:hAnsi="Gulim" w:eastAsia="Gulim"/>
-          <w:b w:val="0"/>
-          <w:i w:val="0"/>
-          <w:sz w:val="24"/>
-          <w:u w:val="none"/>
-        </w:rPr>
-        <w:t>: TS Foundation Models, Multimodal Learning, Knowledge Graph</w:t>
+        <w:ind w:left="850" w:hanging="255"/>
+      </w:pPr>
+      <w:r>
+        <w:rPr>
+          <w:rFonts w:ascii="Gulim" w:hAnsi="Gulim" w:eastAsia="Gulim"/>
+          <w:b w:val="0"/>
+          <w:i w:val="0"/>
+          <w:sz w:val="24"/>
+          <w:u w:val="none"/>
+        </w:rPr>
+        <w:t xml:space="preserve">o  </w:t>
+      </w:r>
+      <w:r>
+        <w:rPr>
+          <w:rFonts w:ascii="Gulim" w:hAnsi="Gulim" w:eastAsia="Gulim"/>
+          <w:b w:val="0"/>
+          <w:i w:val="0"/>
+          <w:sz w:val="24"/>
+          <w:u w:val="none"/>
+        </w:rPr>
+        <w:t>⑤ Supply Chain Knowledge Graph</w:t>
       </w:r>
     </w:p>
     <w:p>
@@ -3913,36 +3929,72 @@
           <w:sz w:val="24"/>
           <w:u w:val="none"/>
         </w:rPr>
-        <w:t>Programming Language</w:t>
-      </w:r>
-      <w:r>
-        <w:rPr>
-          <w:rFonts w:ascii="Gulim" w:hAnsi="Gulim" w:eastAsia="Gulim"/>
-          <w:b w:val="0"/>
-          <w:i w:val="0"/>
-          <w:sz w:val="24"/>
-          <w:u w:val="none"/>
-        </w:rPr>
-        <w:t>: Python</w:t>
+        <w:t>Key Algorithms</w:t>
+      </w:r>
+      <w:r>
+        <w:rPr>
+          <w:rFonts w:ascii="Gulim" w:hAnsi="Gulim" w:eastAsia="Gulim"/>
+          <w:b w:val="0"/>
+          <w:i w:val="0"/>
+          <w:sz w:val="24"/>
+          <w:u w:val="none"/>
+        </w:rPr>
+        <w:t>: TS Foundation Models, Multimodal Learning, LLM Agents, Knowledge Graph</w:t>
       </w:r>
     </w:p>
     <w:p>
       <w:pPr>
-        <w:spacing w:before="160" w:after="20"/>
-      </w:pPr>
+        <w:spacing w:before="0" w:after="0"/>
+        <w:ind w:left="425" w:hanging="255"/>
+      </w:pPr>
+      <w:r>
+        <w:rPr>
+          <w:rFonts w:ascii="Gulim" w:hAnsi="Gulim" w:eastAsia="Gulim"/>
+          <w:b w:val="0"/>
+          <w:i w:val="0"/>
+          <w:sz w:val="24"/>
+          <w:u w:val="none"/>
+        </w:rPr>
+        <w:t xml:space="preserve">• </w:t>
+      </w:r>
       <w:r>
         <w:rPr>
           <w:rFonts w:ascii="Gulim" w:hAnsi="Gulim" w:eastAsia="Gulim"/>
           <w:b/>
           <w:i w:val="0"/>
-          <w:sz w:val="25"/>
-          <w:u w:val="none"/>
-        </w:rPr>
-        <w:t>2. KRAFTON</w:t>
+          <w:sz w:val="24"/>
+          <w:u w:val="none"/>
+        </w:rPr>
+        <w:t>Programming Language</w:t>
+      </w:r>
+      <w:r>
+        <w:rPr>
+          <w:rFonts w:ascii="Gulim" w:hAnsi="Gulim" w:eastAsia="Gulim"/>
+          <w:b w:val="0"/>
+          <w:i w:val="0"/>
+          <w:sz w:val="24"/>
+          <w:u w:val="none"/>
+        </w:rPr>
+        <w:t>: Python</w:t>
       </w:r>
     </w:p>
     <w:p>
       <w:pPr>
+        <w:spacing w:before="0" w:after="20"/>
+      </w:pPr>
+      <w:r>
+        <w:rPr>
+          <w:rFonts w:ascii="Gulim" w:hAnsi="Gulim" w:eastAsia="Gulim"/>
+          <w:b/>
+          <w:i w:val="0"/>
+          <w:sz w:val="25"/>
+          <w:u w:val="none"/>
+        </w:rPr>
+        <w:t>2. KRAFTON</w:t>
+      </w:r>
+    </w:p>
+    <w:p>
+      <w:pPr>
         <w:spacing w:before="0" w:after="0"/>
         <w:ind w:left="425" w:hanging="255"/>
       </w:pPr>
@@ -4211,7 +4263,7 @@
     </w:p>
     <w:p>
       <w:pPr>
-        <w:spacing w:before="160" w:after="20"/>
+        <w:spacing w:before="0" w:after="20"/>
       </w:pPr>
       <w:r>
         <w:rPr>
@@ -4484,7 +4536,7 @@
     </w:p>
     <w:p>
       <w:pPr>
-        <w:spacing w:before="160" w:after="20"/>
+        <w:spacing w:before="0" w:after="20"/>
       </w:pPr>
       <w:r>
         <w:rPr>
@@ -4757,7 +4809,7 @@
     </w:p>
     <w:p>
       <w:pPr>
-        <w:spacing w:before="160" w:after="20"/>
+        <w:spacing w:before="0" w:after="20"/>
       </w:pPr>
       <w:r>
         <w:rPr>

</xml_diff>

<commit_message>
CV: fix cover layout, keep entries from splitting across pages, shorter link labels
Co-Authored-By: Claude Opus 5 (1M context) <noreply@anthropic.com>
</commit_message>
<xml_diff>
--- a/SeunghanLee_CV.docx
+++ b/SeunghanLee_CV.docx
@@ -17,13 +17,13 @@
         </w:tblBorders>
       </w:tblPr>
       <w:tblGrid>
-        <w:gridCol w:w="2381"/>
-        <w:gridCol w:w="7313"/>
+        <w:gridCol w:w="2551"/>
+        <w:gridCol w:w="7200"/>
       </w:tblGrid>
       <w:tr>
         <w:tc>
           <w:tcPr>
-            <w:tcW w:type="dxa" w:w="2381"/>
+            <w:tcW w:type="dxa" w:w="2551"/>
           </w:tcPr>
           <w:p>
             <w:pPr>
@@ -67,7 +67,7 @@
         </w:tc>
         <w:tc>
           <w:tcPr>
-            <w:tcW w:type="dxa" w:w="7313"/>
+            <w:tcW w:type="dxa" w:w="7200"/>
           </w:tcPr>
           <w:p>
             <w:pPr>
@@ -88,7 +88,7 @@
           <w:p>
             <w:pPr>
               <w:spacing w:before="0" w:after="0"/>
-              <w:ind w:left="0" w:hanging="360"/>
+              <w:ind w:left="340" w:hanging="340"/>
             </w:pPr>
             <w:r>
               <w:rPr>
@@ -115,7 +115,7 @@
           <w:p>
             <w:pPr>
               <w:spacing w:before="0" w:after="0"/>
-              <w:ind w:left="0" w:hanging="360"/>
+              <w:ind w:left="340" w:hanging="340"/>
             </w:pPr>
             <w:r>
               <w:rPr>
@@ -142,7 +142,7 @@
           <w:p>
             <w:pPr>
               <w:spacing w:before="0" w:after="0"/>
-              <w:ind w:left="0" w:hanging="360"/>
+              <w:ind w:left="340" w:hanging="340"/>
             </w:pPr>
             <w:r>
               <w:rPr>
@@ -169,7 +169,7 @@
           <w:p>
             <w:pPr>
               <w:spacing w:before="0" w:after="0"/>
-              <w:ind w:left="0" w:hanging="360"/>
+              <w:ind w:left="340" w:hanging="340"/>
             </w:pPr>
             <w:r>
               <w:rPr>
@@ -196,7 +196,7 @@
           <w:p>
             <w:pPr>
               <w:spacing w:before="0" w:after="0"/>
-              <w:ind w:left="720" w:hanging="360"/>
+              <w:ind w:left="964" w:hanging="340"/>
             </w:pPr>
             <w:r>
               <w:rPr>
@@ -236,7 +236,7 @@
           <w:p>
             <w:pPr>
               <w:spacing w:before="0" w:after="0"/>
-              <w:ind w:left="720" w:hanging="360"/>
+              <w:ind w:left="964" w:hanging="340"/>
             </w:pPr>
             <w:r>
               <w:rPr>
@@ -269,14 +269,14 @@
                   <w:sz w:val="20"/>
                   <w:u w:val="single"/>
                 </w:rPr>
-                <w:t>https://www.linkedin.com/in/seunghan-lee-0bba49169/</w:t>
+                <w:t>linkedin.com/in/seunghan-lee-0bba49169</w:t>
               </w:r>
             </w:hyperlink>
           </w:p>
           <w:p>
             <w:pPr>
               <w:spacing w:before="0" w:after="0"/>
-              <w:ind w:left="720" w:hanging="360"/>
+              <w:ind w:left="964" w:hanging="340"/>
             </w:pPr>
             <w:r>
               <w:rPr>
@@ -309,14 +309,14 @@
                   <w:sz w:val="20"/>
                   <w:u w:val="single"/>
                 </w:rPr>
-                <w:t>https://seunghan96.github.io/seunghanlee/</w:t>
+                <w:t>seunghan96.github.io/seunghanlee</w:t>
               </w:r>
             </w:hyperlink>
           </w:p>
           <w:p>
             <w:pPr>
               <w:spacing w:before="0" w:after="0"/>
-              <w:ind w:left="720" w:hanging="360"/>
+              <w:ind w:left="964" w:hanging="340"/>
             </w:pPr>
             <w:r>
               <w:rPr>
@@ -349,7 +349,7 @@
                   <w:sz w:val="20"/>
                   <w:u w:val="single"/>
                 </w:rPr>
-                <w:t>https://seunghan96.github.io/</w:t>
+                <w:t>seunghan96.github.io</w:t>
               </w:r>
             </w:hyperlink>
             <w:r>
@@ -1526,7 +1526,10 @@
     </w:p>
     <w:p>
       <w:pPr>
-        <w:spacing w:before="0" w:after="160"/>
+        <w:pBdr>
+          <w:bottom w:val="single" w:sz="12" w:space="1" w:color="000000"/>
+        </w:pBdr>
+        <w:spacing w:before="0" w:after="40" w:line="240" w:lineRule="auto"/>
       </w:pPr>
       <w:r>
         <w:rPr>
@@ -1536,13 +1539,19 @@
           <w:sz w:val="34"/>
           <w:u w:val="none"/>
         </w:rPr>
-        <w:t xml:space="preserve">3. Publications </w:t>
-      </w:r>
-      <w:r>
-        <w:rPr>
-          <w:rFonts w:ascii="Gulim" w:hAnsi="Gulim" w:eastAsia="Gulim"/>
-          <w:b w:val="0"/>
-          <w:i w:val="0"/>
+        <w:t>3. Publications</w:t>
+      </w:r>
+    </w:p>
+    <w:p>
+      <w:pPr>
+        <w:spacing w:before="0" w:after="120"/>
+      </w:pPr>
+      <w:r>
+        <w:rPr>
+          <w:rFonts w:ascii="Gulim" w:hAnsi="Gulim" w:eastAsia="Gulim"/>
+          <w:b w:val="0"/>
+          <w:i w:val="0"/>
+          <w:sz w:val="21"/>
           <w:u w:val="none"/>
         </w:rPr>
         <w:t>(</w:t>
@@ -1554,6 +1563,7 @@
           <w:i w:val="0"/>
           <w:sz w:val="16"/>
           <w:u w:val="none"/>
+          <w:vertAlign w:val="superscript"/>
         </w:rPr>
         <w:t>*</w:t>
       </w:r>
@@ -1562,6 +1572,7 @@
           <w:rFonts w:ascii="Gulim" w:hAnsi="Gulim" w:eastAsia="Gulim"/>
           <w:b w:val="0"/>
           <w:i w:val="0"/>
+          <w:sz w:val="21"/>
           <w:u w:val="none"/>
         </w:rPr>
         <w:t xml:space="preserve">Equally Contributed, </w:t>
@@ -1573,6 +1584,7 @@
           <w:i w:val="0"/>
           <w:sz w:val="16"/>
           <w:u w:val="none"/>
+          <w:vertAlign w:val="superscript"/>
         </w:rPr>
         <w:t>†</w:t>
       </w:r>
@@ -1581,9 +1593,10 @@
           <w:rFonts w:ascii="Gulim" w:hAnsi="Gulim" w:eastAsia="Gulim"/>
           <w:b w:val="0"/>
           <w:i w:val="0"/>
-          <w:u w:val="none"/>
-        </w:rPr>
-        <w:t>Co-corresponding Authors, )</w:t>
+          <w:sz w:val="21"/>
+          <w:u w:val="none"/>
+        </w:rPr>
+        <w:t>Co-corresponding Authors)</w:t>
       </w:r>
     </w:p>
     <w:p>
@@ -2513,8 +2526,9 @@
           <w:rFonts w:ascii="Gulim" w:hAnsi="Gulim" w:eastAsia="Gulim"/>
           <w:b w:val="0"/>
           <w:i w:val="0"/>
-          <w:sz w:val="14"/>
-          <w:u w:val="none"/>
+          <w:sz w:val="15"/>
+          <w:u w:val="none"/>
+          <w:vertAlign w:val="superscript"/>
         </w:rPr>
         <w:t>†</w:t>
       </w:r>
@@ -2533,8 +2547,9 @@
           <w:rFonts w:ascii="Gulim" w:hAnsi="Gulim" w:eastAsia="Gulim"/>
           <w:b w:val="0"/>
           <w:i w:val="0"/>
-          <w:sz w:val="14"/>
-          <w:u w:val="none"/>
+          <w:sz w:val="15"/>
+          <w:u w:val="none"/>
+          <w:vertAlign w:val="superscript"/>
         </w:rPr>
         <w:t>†</w:t>
       </w:r>
@@ -2634,8 +2649,9 @@
           <w:rFonts w:ascii="Gulim" w:hAnsi="Gulim" w:eastAsia="Gulim"/>
           <w:b w:val="0"/>
           <w:i w:val="0"/>
-          <w:sz w:val="14"/>
-          <w:u w:val="none"/>
+          <w:sz w:val="15"/>
+          <w:u w:val="none"/>
+          <w:vertAlign w:val="superscript"/>
         </w:rPr>
         <w:t>*</w:t>
       </w:r>
@@ -2654,8 +2670,9 @@
           <w:rFonts w:ascii="Gulim" w:hAnsi="Gulim" w:eastAsia="Gulim"/>
           <w:b w:val="0"/>
           <w:i w:val="0"/>
-          <w:sz w:val="14"/>
-          <w:u w:val="none"/>
+          <w:sz w:val="15"/>
+          <w:u w:val="none"/>
+          <w:vertAlign w:val="superscript"/>
         </w:rPr>
         <w:t>*</w:t>
       </w:r>
@@ -2674,8 +2691,9 @@
           <w:rFonts w:ascii="Gulim" w:hAnsi="Gulim" w:eastAsia="Gulim"/>
           <w:b w:val="0"/>
           <w:i w:val="0"/>
-          <w:sz w:val="14"/>
-          <w:u w:val="none"/>
+          <w:sz w:val="15"/>
+          <w:u w:val="none"/>
+          <w:vertAlign w:val="superscript"/>
         </w:rPr>
         <w:t>†</w:t>
       </w:r>
@@ -2694,8 +2712,9 @@
           <w:rFonts w:ascii="Gulim" w:hAnsi="Gulim" w:eastAsia="Gulim"/>
           <w:b w:val="0"/>
           <w:i w:val="0"/>
-          <w:sz w:val="14"/>
-          <w:u w:val="none"/>
+          <w:sz w:val="15"/>
+          <w:u w:val="none"/>
+          <w:vertAlign w:val="superscript"/>
         </w:rPr>
         <w:t>†</w:t>
       </w:r>
@@ -2805,8 +2824,9 @@
           <w:rFonts w:ascii="Gulim" w:hAnsi="Gulim" w:eastAsia="Gulim"/>
           <w:b w:val="0"/>
           <w:i w:val="0"/>
-          <w:sz w:val="14"/>
-          <w:u w:val="none"/>
+          <w:sz w:val="15"/>
+          <w:u w:val="none"/>
+          <w:vertAlign w:val="superscript"/>
         </w:rPr>
         <w:t>†</w:t>
       </w:r>
@@ -2825,8 +2845,9 @@
           <w:rFonts w:ascii="Gulim" w:hAnsi="Gulim" w:eastAsia="Gulim"/>
           <w:b w:val="0"/>
           <w:i w:val="0"/>
-          <w:sz w:val="14"/>
-          <w:u w:val="none"/>
+          <w:sz w:val="15"/>
+          <w:u w:val="none"/>
+          <w:vertAlign w:val="superscript"/>
         </w:rPr>
         <w:t>†</w:t>
       </w:r>
@@ -2958,8 +2979,9 @@
           <w:rFonts w:ascii="Gulim" w:hAnsi="Gulim" w:eastAsia="Gulim"/>
           <w:b w:val="0"/>
           <w:i w:val="0"/>
-          <w:sz w:val="14"/>
-          <w:u w:val="none"/>
+          <w:sz w:val="15"/>
+          <w:u w:val="none"/>
+          <w:vertAlign w:val="superscript"/>
         </w:rPr>
         <w:t>†</w:t>
       </w:r>
@@ -2978,8 +3000,9 @@
           <w:rFonts w:ascii="Gulim" w:hAnsi="Gulim" w:eastAsia="Gulim"/>
           <w:b w:val="0"/>
           <w:i w:val="0"/>
-          <w:sz w:val="14"/>
-          <w:u w:val="none"/>
+          <w:sz w:val="15"/>
+          <w:u w:val="none"/>
+          <w:vertAlign w:val="superscript"/>
         </w:rPr>
         <w:t>†</w:t>
       </w:r>
@@ -3469,8 +3492,9 @@
           <w:rFonts w:ascii="Gulim" w:hAnsi="Gulim" w:eastAsia="Gulim"/>
           <w:b w:val="0"/>
           <w:i w:val="0"/>
-          <w:sz w:val="14"/>
-          <w:u w:val="none"/>
+          <w:sz w:val="15"/>
+          <w:u w:val="none"/>
+          <w:vertAlign w:val="superscript"/>
         </w:rPr>
         <w:t>*</w:t>
       </w:r>
@@ -3489,8 +3513,9 @@
           <w:rFonts w:ascii="Gulim" w:hAnsi="Gulim" w:eastAsia="Gulim"/>
           <w:b w:val="0"/>
           <w:i w:val="0"/>
-          <w:sz w:val="14"/>
-          <w:u w:val="none"/>
+          <w:sz w:val="15"/>
+          <w:u w:val="none"/>
+          <w:vertAlign w:val="superscript"/>
         </w:rPr>
         <w:t>*</w:t>
       </w:r>

</xml_diff>

<commit_message>
CV: add the four new 2026 papers and keep the build toolkit in-tree
Publications 18-21: When Summaries Distort Decisions (EMNLP 2026) and the
FinVerse / ReasonCast / Beyond Magnitude preprints. FinSTaR moves to
EMNLP 2026 with the KDD workshop as its preliminary version. Still 12 pages.

The scripts that produced the PDF only ever lived in a /tmp scratchpad, so
they are now committed under cv_build/ with the fonts and a README. One fix
was needed: the leading floor used max(base, MARK_PT / S), which inflated
line boxes for the banner theme (scale 0.85) and grew the CV to 14 pages;
max(base, MARK_PT) reproduces the shipped layout pixel for pixel.

Co-Authored-By: Claude Opus 5 (1M context) <noreply@anthropic.com>
</commit_message>
<xml_diff>
--- a/SeunghanLee_CV.docx
+++ b/SeunghanLee_CV.docx
@@ -1659,7 +1659,7 @@
           <w:sz w:val="21"/>
           <w:u w:val="none"/>
         </w:rPr>
-        <w:t>17. AdaTKG: Adaptive Memory for Temporal Knowledge Graph Reasoning (2026)</w:t>
+        <w:t>21. FinVerse: Financial Time-Series Benchmark (2026)</w:t>
       </w:r>
     </w:p>
     <w:p>
@@ -1674,7 +1674,7 @@
           <w:sz w:val="19"/>
           <w:u w:val="none"/>
         </w:rPr>
-        <w:t xml:space="preserve">- </w:t>
+        <w:t xml:space="preserve">- Jaehoon Lee, Jun Seo, </w:t>
       </w:r>
       <w:r>
         <w:rPr>
@@ -1694,7 +1694,7 @@
           <w:sz w:val="19"/>
           <w:u w:val="none"/>
         </w:rPr>
-        <w:t>, Jun Seo, Jaehoon Lee, Sungdong Yoo, Minjae Kim, Tae Yoon Lim, Dongwan Kang, Hwanil Choi, SoonYoung Lee, Wonbin Ahn</w:t>
+        <w:t>, Tae Yoon Lim, Dongwan Kang, Hwanil Choi, Minjae Kim, Sungdong Yoo, Junhyeok Kang, Sangjun Han, Soonyoung Lee, Wonbin Ahn</w:t>
       </w:r>
     </w:p>
     <w:p>
@@ -1720,19 +1720,21 @@
           <w:sz w:val="19"/>
           <w:u w:val="none"/>
         </w:rPr>
-        <w:t xml:space="preserve">KDDW (GMLLM), 2026. </w:t>
-      </w:r>
-      <w:r>
-        <w:rPr>
-          <w:rFonts w:ascii="Lato" w:hAnsi="Lato" w:eastAsia="Lato" w:cs="Lato"/>
-          <w:b w:val="0"/>
-          <w:i w:val="0"/>
-          <w:color w:val="C4761A"/>
-          <w:sz w:val="19"/>
-          <w:u w:val="none"/>
-        </w:rPr>
-        <w:t xml:space="preserve">Oral </w:t>
-      </w:r>
+        <w:t>arXiv preprint, 2026. [</w:t>
+      </w:r>
+      <w:hyperlink r:id="rId16">
+        <w:r>
+          <w:rPr>
+            <w:rFonts w:ascii="Lato" w:hAnsi="Lato" w:eastAsia="Lato" w:cs="Lato"/>
+            <w:b w:val="0"/>
+            <w:i w:val="0"/>
+            <w:color w:val="0F3D57"/>
+            <w:sz w:val="19"/>
+            <w:u w:val="single"/>
+          </w:rPr>
+          <w:t>arxiv:2608.03259</w:t>
+        </w:r>
+      </w:hyperlink>
       <w:r>
         <w:rPr>
           <w:rFonts w:ascii="Lato" w:hAnsi="Lato" w:eastAsia="Lato" w:cs="Lato"/>
@@ -1742,9 +1744,411 @@
           <w:sz w:val="19"/>
           <w:u w:val="none"/>
         </w:rPr>
+        <w:t>]</w:t>
+      </w:r>
+    </w:p>
+    <w:p>
+      <w:pPr>
+        <w:spacing w:before="176" w:after="20"/>
+      </w:pPr>
+      <w:r>
+        <w:rPr>
+          <w:rFonts w:ascii="Lato" w:hAnsi="Lato" w:eastAsia="Lato" w:cs="Lato"/>
+          <w:b/>
+          <w:i w:val="0"/>
+          <w:color w:val="0F3D57"/>
+          <w:sz w:val="21"/>
+          <w:u w:val="none"/>
+        </w:rPr>
+        <w:t>20. ReasonCast: Towards Explainable Time Series Forecasting with Reasoning (2026)</w:t>
+      </w:r>
+    </w:p>
+    <w:p>
+      <w:pPr>
+        <w:spacing w:before="0" w:after="0"/>
+      </w:pPr>
+      <w:r>
+        <w:rPr>
+          <w:rFonts w:ascii="Lato" w:hAnsi="Lato" w:eastAsia="Lato" w:cs="Lato"/>
+          <w:b w:val="0"/>
+          <w:i w:val="0"/>
+          <w:sz w:val="19"/>
+          <w:u w:val="none"/>
+        </w:rPr>
+        <w:t xml:space="preserve">- </w:t>
+      </w:r>
+      <w:r>
+        <w:rPr>
+          <w:rFonts w:ascii="Lato" w:hAnsi="Lato" w:eastAsia="Lato" w:cs="Lato"/>
+          <w:b/>
+          <w:i w:val="0"/>
+          <w:sz w:val="19"/>
+          <w:u w:val="none"/>
+        </w:rPr>
+        <w:t>Seunghan Lee</w:t>
+      </w:r>
+      <w:r>
+        <w:rPr>
+          <w:rFonts w:ascii="Lato" w:hAnsi="Lato" w:eastAsia="Lato" w:cs="Lato"/>
+          <w:b w:val="0"/>
+          <w:i w:val="0"/>
+          <w:sz w:val="19"/>
+          <w:u w:val="none"/>
+        </w:rPr>
+        <w:t>, Jun Seo, Jaehoon Lee, Junhyeok Kang, Sangjun Han, Sungdong Yoo, Minjae Kim, Tae Yoon Lim, Dongwan Kang, Hwanil Choi, Soonyoung Lee, Wonbin Ahn</w:t>
+      </w:r>
+    </w:p>
+    <w:p>
+      <w:pPr>
+        <w:spacing w:before="0" w:after="0"/>
+      </w:pPr>
+      <w:r>
+        <w:rPr>
+          <w:rFonts w:ascii="Lato" w:hAnsi="Lato" w:eastAsia="Lato" w:cs="Lato"/>
+          <w:b w:val="0"/>
+          <w:i w:val="0"/>
+          <w:sz w:val="19"/>
+          <w:u w:val="none"/>
+        </w:rPr>
+        <w:t xml:space="preserve">- In </w:t>
+      </w:r>
+      <w:r>
+        <w:rPr>
+          <w:rFonts w:ascii="Lato" w:hAnsi="Lato" w:eastAsia="Lato" w:cs="Lato"/>
+          <w:b w:val="0"/>
+          <w:i/>
+          <w:color w:val="4A4A4A"/>
+          <w:sz w:val="19"/>
+          <w:u w:val="none"/>
+        </w:rPr>
+        <w:t>arXiv preprint, 2026. [</w:t>
+      </w:r>
+      <w:hyperlink r:id="rId17">
+        <w:r>
+          <w:rPr>
+            <w:rFonts w:ascii="Lato" w:hAnsi="Lato" w:eastAsia="Lato" w:cs="Lato"/>
+            <w:b w:val="0"/>
+            <w:i w:val="0"/>
+            <w:color w:val="0F3D57"/>
+            <w:sz w:val="19"/>
+            <w:u w:val="single"/>
+          </w:rPr>
+          <w:t>arxiv:2608.01875</w:t>
+        </w:r>
+      </w:hyperlink>
+      <w:r>
+        <w:rPr>
+          <w:rFonts w:ascii="Lato" w:hAnsi="Lato" w:eastAsia="Lato" w:cs="Lato"/>
+          <w:b w:val="0"/>
+          <w:i/>
+          <w:color w:val="4A4A4A"/>
+          <w:sz w:val="19"/>
+          <w:u w:val="none"/>
+        </w:rPr>
+        <w:t>]</w:t>
+      </w:r>
+    </w:p>
+    <w:p>
+      <w:pPr>
+        <w:spacing w:before="176" w:after="20"/>
+      </w:pPr>
+      <w:r>
+        <w:rPr>
+          <w:rFonts w:ascii="Lato" w:hAnsi="Lato" w:eastAsia="Lato" w:cs="Lato"/>
+          <w:b/>
+          <w:i w:val="0"/>
+          <w:color w:val="0F3D57"/>
+          <w:sz w:val="21"/>
+          <w:u w:val="none"/>
+        </w:rPr>
+        <w:t>19. Beyond Magnitude and Shape: A Direction-Aware Loss for Time Series Forecasting (2026)</w:t>
+      </w:r>
+    </w:p>
+    <w:p>
+      <w:pPr>
+        <w:spacing w:before="0" w:after="0"/>
+      </w:pPr>
+      <w:r>
+        <w:rPr>
+          <w:rFonts w:ascii="Lato" w:hAnsi="Lato" w:eastAsia="Lato" w:cs="Lato"/>
+          <w:b w:val="0"/>
+          <w:i w:val="0"/>
+          <w:sz w:val="19"/>
+          <w:u w:val="none"/>
+        </w:rPr>
+        <w:t xml:space="preserve">- </w:t>
+      </w:r>
+      <w:r>
+        <w:rPr>
+          <w:rFonts w:ascii="Lato" w:hAnsi="Lato" w:eastAsia="Lato" w:cs="Lato"/>
+          <w:b/>
+          <w:i w:val="0"/>
+          <w:sz w:val="19"/>
+          <w:u w:val="none"/>
+        </w:rPr>
+        <w:t>Seunghan Lee</w:t>
+      </w:r>
+      <w:r>
+        <w:rPr>
+          <w:rFonts w:ascii="Lato" w:hAnsi="Lato" w:eastAsia="Lato" w:cs="Lato"/>
+          <w:b w:val="0"/>
+          <w:i w:val="0"/>
+          <w:sz w:val="19"/>
+          <w:u w:val="none"/>
+        </w:rPr>
+        <w:t>, Jaehoon Lee, Jun Seo, Junhyeok Kang, Sangjun Han, Sungdong Yoo, Minjae Kim, Tae Yoon Lim, Dongwan Kang, Hwanil Choi, Soonyoung Lee, Wonbin Ahn</w:t>
+      </w:r>
+    </w:p>
+    <w:p>
+      <w:pPr>
+        <w:spacing w:before="0" w:after="0"/>
+      </w:pPr>
+      <w:r>
+        <w:rPr>
+          <w:rFonts w:ascii="Lato" w:hAnsi="Lato" w:eastAsia="Lato" w:cs="Lato"/>
+          <w:b w:val="0"/>
+          <w:i w:val="0"/>
+          <w:sz w:val="19"/>
+          <w:u w:val="none"/>
+        </w:rPr>
+        <w:t xml:space="preserve">- In </w:t>
+      </w:r>
+      <w:r>
+        <w:rPr>
+          <w:rFonts w:ascii="Lato" w:hAnsi="Lato" w:eastAsia="Lato" w:cs="Lato"/>
+          <w:b w:val="0"/>
+          <w:i/>
+          <w:color w:val="4A4A4A"/>
+          <w:sz w:val="19"/>
+          <w:u w:val="none"/>
+        </w:rPr>
+        <w:t>arXiv preprint, 2026. [</w:t>
+      </w:r>
+      <w:hyperlink r:id="rId18">
+        <w:r>
+          <w:rPr>
+            <w:rFonts w:ascii="Lato" w:hAnsi="Lato" w:eastAsia="Lato" w:cs="Lato"/>
+            <w:b w:val="0"/>
+            <w:i w:val="0"/>
+            <w:color w:val="0F3D57"/>
+            <w:sz w:val="19"/>
+            <w:u w:val="single"/>
+          </w:rPr>
+          <w:t>arxiv:2608.01857</w:t>
+        </w:r>
+      </w:hyperlink>
+      <w:r>
+        <w:rPr>
+          <w:rFonts w:ascii="Lato" w:hAnsi="Lato" w:eastAsia="Lato" w:cs="Lato"/>
+          <w:b w:val="0"/>
+          <w:i/>
+          <w:color w:val="4A4A4A"/>
+          <w:sz w:val="19"/>
+          <w:u w:val="none"/>
+        </w:rPr>
+        <w:t>]</w:t>
+      </w:r>
+    </w:p>
+    <w:p>
+      <w:pPr>
+        <w:spacing w:before="176" w:after="20"/>
+      </w:pPr>
+      <w:r>
+        <w:rPr>
+          <w:rFonts w:ascii="Lato" w:hAnsi="Lato" w:eastAsia="Lato" w:cs="Lato"/>
+          <w:b/>
+          <w:i w:val="0"/>
+          <w:color w:val="0F3D57"/>
+          <w:sz w:val="21"/>
+          <w:u w:val="none"/>
+        </w:rPr>
+        <w:t>18. When Summaries Distort Decisions: Information Fidelity in LLM-Compressed Financial Analysis (2026)</w:t>
+      </w:r>
+    </w:p>
+    <w:p>
+      <w:pPr>
+        <w:spacing w:before="0" w:after="0"/>
+      </w:pPr>
+      <w:r>
+        <w:rPr>
+          <w:rFonts w:ascii="Lato" w:hAnsi="Lato" w:eastAsia="Lato" w:cs="Lato"/>
+          <w:b w:val="0"/>
+          <w:i w:val="0"/>
+          <w:sz w:val="19"/>
+          <w:u w:val="none"/>
+        </w:rPr>
+        <w:t xml:space="preserve">- Hoyoung Lee, Suhwan Park, </w:t>
+      </w:r>
+      <w:r>
+        <w:rPr>
+          <w:rFonts w:ascii="Lato" w:hAnsi="Lato" w:eastAsia="Lato" w:cs="Lato"/>
+          <w:b/>
+          <w:i w:val="0"/>
+          <w:sz w:val="19"/>
+          <w:u w:val="none"/>
+        </w:rPr>
+        <w:t>Seunghan Lee</w:t>
+      </w:r>
+      <w:r>
+        <w:rPr>
+          <w:rFonts w:ascii="Lato" w:hAnsi="Lato" w:eastAsia="Lato" w:cs="Lato"/>
+          <w:b w:val="0"/>
+          <w:i w:val="0"/>
+          <w:sz w:val="19"/>
+          <w:u w:val="none"/>
+        </w:rPr>
+        <w:t>, Jun Seo, Jaehoon Lee, Sungdong Yoo, Minjae Kim, CheolWon Na, Zhangyang Wang, Zach Golkhou, Minkyu Kim, Sotirios Sabanis, Alejandro Lopez-Lira, Dhagash Mehta, Soonyoung Lee, Chanyeol Choi, Wonbin Ahn, Yongjae Lee</w:t>
+      </w:r>
+    </w:p>
+    <w:p>
+      <w:pPr>
+        <w:spacing w:before="0" w:after="0"/>
+      </w:pPr>
+      <w:r>
+        <w:rPr>
+          <w:rFonts w:ascii="Lato" w:hAnsi="Lato" w:eastAsia="Lato" w:cs="Lato"/>
+          <w:b w:val="0"/>
+          <w:i w:val="0"/>
+          <w:sz w:val="19"/>
+          <w:u w:val="none"/>
+        </w:rPr>
+        <w:t xml:space="preserve">- In </w:t>
+      </w:r>
+      <w:r>
+        <w:rPr>
+          <w:rFonts w:ascii="Lato" w:hAnsi="Lato" w:eastAsia="Lato" w:cs="Lato"/>
+          <w:b w:val="0"/>
+          <w:i/>
+          <w:color w:val="4A4A4A"/>
+          <w:sz w:val="19"/>
+          <w:u w:val="none"/>
+        </w:rPr>
+        <w:t>EMNLP, 2026. [</w:t>
+      </w:r>
+      <w:hyperlink r:id="rId19">
+        <w:r>
+          <w:rPr>
+            <w:rFonts w:ascii="Lato" w:hAnsi="Lato" w:eastAsia="Lato" w:cs="Lato"/>
+            <w:b w:val="0"/>
+            <w:i w:val="0"/>
+            <w:color w:val="0F3D57"/>
+            <w:sz w:val="19"/>
+            <w:u w:val="single"/>
+          </w:rPr>
+          <w:t>arxiv:2606.29251</w:t>
+        </w:r>
+      </w:hyperlink>
+      <w:r>
+        <w:rPr>
+          <w:rFonts w:ascii="Lato" w:hAnsi="Lato" w:eastAsia="Lato" w:cs="Lato"/>
+          <w:b w:val="0"/>
+          <w:i/>
+          <w:color w:val="4A4A4A"/>
+          <w:sz w:val="19"/>
+          <w:u w:val="none"/>
+        </w:rPr>
+        <w:t>]</w:t>
+      </w:r>
+    </w:p>
+    <w:p>
+      <w:pPr>
+        <w:spacing w:before="176" w:after="20"/>
+      </w:pPr>
+      <w:r>
+        <w:rPr>
+          <w:rFonts w:ascii="Lato" w:hAnsi="Lato" w:eastAsia="Lato" w:cs="Lato"/>
+          <w:b/>
+          <w:i w:val="0"/>
+          <w:color w:val="0F3D57"/>
+          <w:sz w:val="21"/>
+          <w:u w:val="none"/>
+        </w:rPr>
+        <w:t>17. AdaTKG: Adaptive Memory for Temporal Knowledge Graph Reasoning (2026)</w:t>
+      </w:r>
+    </w:p>
+    <w:p>
+      <w:pPr>
+        <w:spacing w:before="0" w:after="0"/>
+      </w:pPr>
+      <w:r>
+        <w:rPr>
+          <w:rFonts w:ascii="Lato" w:hAnsi="Lato" w:eastAsia="Lato" w:cs="Lato"/>
+          <w:b w:val="0"/>
+          <w:i w:val="0"/>
+          <w:sz w:val="19"/>
+          <w:u w:val="none"/>
+        </w:rPr>
+        <w:t xml:space="preserve">- </w:t>
+      </w:r>
+      <w:r>
+        <w:rPr>
+          <w:rFonts w:ascii="Lato" w:hAnsi="Lato" w:eastAsia="Lato" w:cs="Lato"/>
+          <w:b/>
+          <w:i w:val="0"/>
+          <w:sz w:val="19"/>
+          <w:u w:val="none"/>
+        </w:rPr>
+        <w:t>Seunghan Lee</w:t>
+      </w:r>
+      <w:r>
+        <w:rPr>
+          <w:rFonts w:ascii="Lato" w:hAnsi="Lato" w:eastAsia="Lato" w:cs="Lato"/>
+          <w:b w:val="0"/>
+          <w:i w:val="0"/>
+          <w:sz w:val="19"/>
+          <w:u w:val="none"/>
+        </w:rPr>
+        <w:t>, Jun Seo, Jaehoon Lee, Sungdong Yoo, Minjae Kim, Tae Yoon Lim, Dongwan Kang, Hwanil Choi, SoonYoung Lee, Wonbin Ahn</w:t>
+      </w:r>
+    </w:p>
+    <w:p>
+      <w:pPr>
+        <w:spacing w:before="0" w:after="0"/>
+      </w:pPr>
+      <w:r>
+        <w:rPr>
+          <w:rFonts w:ascii="Lato" w:hAnsi="Lato" w:eastAsia="Lato" w:cs="Lato"/>
+          <w:b w:val="0"/>
+          <w:i w:val="0"/>
+          <w:sz w:val="19"/>
+          <w:u w:val="none"/>
+        </w:rPr>
+        <w:t xml:space="preserve">- In </w:t>
+      </w:r>
+      <w:r>
+        <w:rPr>
+          <w:rFonts w:ascii="Lato" w:hAnsi="Lato" w:eastAsia="Lato" w:cs="Lato"/>
+          <w:b w:val="0"/>
+          <w:i/>
+          <w:color w:val="4A4A4A"/>
+          <w:sz w:val="19"/>
+          <w:u w:val="none"/>
+        </w:rPr>
+        <w:t xml:space="preserve">KDDW (GMLLM), 2026. </w:t>
+      </w:r>
+      <w:r>
+        <w:rPr>
+          <w:rFonts w:ascii="Lato" w:hAnsi="Lato" w:eastAsia="Lato" w:cs="Lato"/>
+          <w:b w:val="0"/>
+          <w:i w:val="0"/>
+          <w:color w:val="C4761A"/>
+          <w:sz w:val="19"/>
+          <w:u w:val="none"/>
+        </w:rPr>
+        <w:t xml:space="preserve">Oral </w:t>
+      </w:r>
+      <w:r>
+        <w:rPr>
+          <w:rFonts w:ascii="Lato" w:hAnsi="Lato" w:eastAsia="Lato" w:cs="Lato"/>
+          <w:b w:val="0"/>
+          <w:i/>
+          <w:color w:val="4A4A4A"/>
+          <w:sz w:val="19"/>
+          <w:u w:val="none"/>
+        </w:rPr>
         <w:t>[</w:t>
       </w:r>
-      <w:hyperlink r:id="rId16">
+      <w:hyperlink r:id="rId20">
         <w:r>
           <w:rPr>
             <w:rFonts w:ascii="Lato" w:hAnsi="Lato" w:eastAsia="Lato" w:cs="Lato"/>
@@ -1843,31 +2247,9 @@
           <w:sz w:val="19"/>
           <w:u w:val="none"/>
         </w:rPr>
-        <w:t xml:space="preserve">KDDW, 2026. </w:t>
-      </w:r>
-      <w:r>
-        <w:rPr>
-          <w:rFonts w:ascii="Lato" w:hAnsi="Lato" w:eastAsia="Lato" w:cs="Lato"/>
-          <w:b w:val="0"/>
-          <w:i w:val="0"/>
-          <w:color w:val="C4761A"/>
-          <w:sz w:val="19"/>
-          <w:u w:val="none"/>
-        </w:rPr>
-        <w:t xml:space="preserve">Oral </w:t>
-      </w:r>
-      <w:r>
-        <w:rPr>
-          <w:rFonts w:ascii="Lato" w:hAnsi="Lato" w:eastAsia="Lato" w:cs="Lato"/>
-          <w:b w:val="0"/>
-          <w:i/>
-          <w:color w:val="4A4A4A"/>
-          <w:sz w:val="19"/>
-          <w:u w:val="none"/>
-        </w:rPr>
-        <w:t>[</w:t>
-      </w:r>
-      <w:hyperlink r:id="rId17">
+        <w:t>EMNLP, 2026. [</w:t>
+      </w:r>
+      <w:hyperlink r:id="rId21">
         <w:r>
           <w:rPr>
             <w:rFonts w:ascii="Lato" w:hAnsi="Lato" w:eastAsia="Lato" w:cs="Lato"/>
@@ -1894,69 +2276,8 @@
     </w:p>
     <w:p>
       <w:pPr>
-        <w:spacing w:before="176" w:after="20"/>
-      </w:pPr>
-      <w:r>
-        <w:rPr>
-          <w:rFonts w:ascii="Lato" w:hAnsi="Lato" w:eastAsia="Lato" w:cs="Lato"/>
-          <w:b/>
-          <w:i w:val="0"/>
-          <w:color w:val="0F3D57"/>
-          <w:sz w:val="21"/>
-          <w:u w:val="none"/>
-        </w:rPr>
-        <w:t>15. Not All Retrievals are Useful: Cross-Attention for Input-Aware RAG in Time Series Forecasting (2026)</w:t>
-      </w:r>
-    </w:p>
-    <w:p>
-      <w:pPr>
         <w:spacing w:before="0" w:after="0"/>
       </w:pPr>
-      <w:r>
-        <w:rPr>
-          <w:rFonts w:ascii="Lato" w:hAnsi="Lato" w:eastAsia="Lato" w:cs="Lato"/>
-          <w:b w:val="0"/>
-          <w:i w:val="0"/>
-          <w:sz w:val="19"/>
-          <w:u w:val="none"/>
-        </w:rPr>
-        <w:t xml:space="preserve">- </w:t>
-      </w:r>
-      <w:r>
-        <w:rPr>
-          <w:rFonts w:ascii="Lato" w:hAnsi="Lato" w:eastAsia="Lato" w:cs="Lato"/>
-          <w:b/>
-          <w:i w:val="0"/>
-          <w:sz w:val="19"/>
-          <w:u w:val="none"/>
-        </w:rPr>
-        <w:t>Seunghan Lee</w:t>
-      </w:r>
-      <w:r>
-        <w:rPr>
-          <w:rFonts w:ascii="Lato" w:hAnsi="Lato" w:eastAsia="Lato" w:cs="Lato"/>
-          <w:b w:val="0"/>
-          <w:i w:val="0"/>
-          <w:sz w:val="19"/>
-          <w:u w:val="none"/>
-        </w:rPr>
-        <w:t>, Jaehoon Lee, Jun Seo, Sungdong Yoo, Minjae Kim, Tae Yoon Lim, Dongwan Kang, Hwanil Choi, SoonYoung Lee, Wonbin Ahn</w:t>
-      </w:r>
-    </w:p>
-    <w:p>
-      <w:pPr>
-        <w:spacing w:before="0" w:after="0"/>
-      </w:pPr>
-      <w:r>
-        <w:rPr>
-          <w:rFonts w:ascii="Lato" w:hAnsi="Lato" w:eastAsia="Lato" w:cs="Lato"/>
-          <w:b w:val="0"/>
-          <w:i w:val="0"/>
-          <w:sz w:val="19"/>
-          <w:u w:val="none"/>
-        </w:rPr>
-        <w:t xml:space="preserve">- In </w:t>
-      </w:r>
       <w:r>
         <w:rPr>
           <w:rFonts w:ascii="Lato" w:hAnsi="Lato" w:eastAsia="Lato" w:cs="Lato"/>
@@ -1966,7 +2287,7 @@
           <w:sz w:val="19"/>
           <w:u w:val="none"/>
         </w:rPr>
-        <w:t xml:space="preserve">KDDW (MILETS), 2026. </w:t>
+        <w:t xml:space="preserve">- Preliminary version: KDDW, 2026. </w:t>
       </w:r>
       <w:r>
         <w:rPr>
@@ -1977,7 +2298,73 @@
           <w:sz w:val="19"/>
           <w:u w:val="none"/>
         </w:rPr>
-        <w:t xml:space="preserve">Oral </w:t>
+        <w:t>Oral</w:t>
+      </w:r>
+    </w:p>
+    <w:p>
+      <w:pPr>
+        <w:spacing w:before="176" w:after="20"/>
+      </w:pPr>
+      <w:r>
+        <w:rPr>
+          <w:rFonts w:ascii="Lato" w:hAnsi="Lato" w:eastAsia="Lato" w:cs="Lato"/>
+          <w:b/>
+          <w:i w:val="0"/>
+          <w:color w:val="0F3D57"/>
+          <w:sz w:val="21"/>
+          <w:u w:val="none"/>
+        </w:rPr>
+        <w:t>15. Not All Retrievals are Useful: Cross-Attention for Input-Aware RAG in Time Series Forecasting (2026)</w:t>
+      </w:r>
+    </w:p>
+    <w:p>
+      <w:pPr>
+        <w:spacing w:before="0" w:after="0"/>
+      </w:pPr>
+      <w:r>
+        <w:rPr>
+          <w:rFonts w:ascii="Lato" w:hAnsi="Lato" w:eastAsia="Lato" w:cs="Lato"/>
+          <w:b w:val="0"/>
+          <w:i w:val="0"/>
+          <w:sz w:val="19"/>
+          <w:u w:val="none"/>
+        </w:rPr>
+        <w:t xml:space="preserve">- </w:t>
+      </w:r>
+      <w:r>
+        <w:rPr>
+          <w:rFonts w:ascii="Lato" w:hAnsi="Lato" w:eastAsia="Lato" w:cs="Lato"/>
+          <w:b/>
+          <w:i w:val="0"/>
+          <w:sz w:val="19"/>
+          <w:u w:val="none"/>
+        </w:rPr>
+        <w:t>Seunghan Lee</w:t>
+      </w:r>
+      <w:r>
+        <w:rPr>
+          <w:rFonts w:ascii="Lato" w:hAnsi="Lato" w:eastAsia="Lato" w:cs="Lato"/>
+          <w:b w:val="0"/>
+          <w:i w:val="0"/>
+          <w:sz w:val="19"/>
+          <w:u w:val="none"/>
+        </w:rPr>
+        <w:t>, Jaehoon Lee, Jun Seo, Sungdong Yoo, Minjae Kim, Tae Yoon Lim, Dongwan Kang, Hwanil Choi, SoonYoung Lee, Wonbin Ahn</w:t>
+      </w:r>
+    </w:p>
+    <w:p>
+      <w:pPr>
+        <w:spacing w:before="0" w:after="0"/>
+      </w:pPr>
+      <w:r>
+        <w:rPr>
+          <w:rFonts w:ascii="Lato" w:hAnsi="Lato" w:eastAsia="Lato" w:cs="Lato"/>
+          <w:b w:val="0"/>
+          <w:i w:val="0"/>
+          <w:sz w:val="19"/>
+          <w:u w:val="none"/>
+        </w:rPr>
+        <w:t xml:space="preserve">- In </w:t>
       </w:r>
       <w:r>
         <w:rPr>
@@ -1988,9 +2375,31 @@
           <w:sz w:val="19"/>
           <w:u w:val="none"/>
         </w:rPr>
+        <w:t xml:space="preserve">KDDW (MILETS), 2026. </w:t>
+      </w:r>
+      <w:r>
+        <w:rPr>
+          <w:rFonts w:ascii="Lato" w:hAnsi="Lato" w:eastAsia="Lato" w:cs="Lato"/>
+          <w:b w:val="0"/>
+          <w:i w:val="0"/>
+          <w:color w:val="C4761A"/>
+          <w:sz w:val="19"/>
+          <w:u w:val="none"/>
+        </w:rPr>
+        <w:t xml:space="preserve">Oral </w:t>
+      </w:r>
+      <w:r>
+        <w:rPr>
+          <w:rFonts w:ascii="Lato" w:hAnsi="Lato" w:eastAsia="Lato" w:cs="Lato"/>
+          <w:b w:val="0"/>
+          <w:i/>
+          <w:color w:val="4A4A4A"/>
+          <w:sz w:val="19"/>
+          <w:u w:val="none"/>
+        </w:rPr>
         <w:t>[</w:t>
       </w:r>
-      <w:hyperlink r:id="rId18">
+      <w:hyperlink r:id="rId22">
         <w:r>
           <w:rPr>
             <w:rFonts w:ascii="Lato" w:hAnsi="Lato" w:eastAsia="Lato" w:cs="Lato"/>
@@ -2113,7 +2522,7 @@
         </w:rPr>
         <w:t>[</w:t>
       </w:r>
-      <w:hyperlink r:id="rId19">
+      <w:hyperlink r:id="rId23">
         <w:r>
           <w:rPr>
             <w:rFonts w:ascii="Lato" w:hAnsi="Lato" w:eastAsia="Lato" w:cs="Lato"/>
@@ -2214,7 +2623,7 @@
         </w:rPr>
         <w:t>KDD, 2026. [</w:t>
       </w:r>
-      <w:hyperlink r:id="rId20">
+      <w:hyperlink r:id="rId24">
         <w:r>
           <w:rPr>
             <w:rFonts w:ascii="Lato" w:hAnsi="Lato" w:eastAsia="Lato" w:cs="Lato"/>
@@ -2315,7 +2724,7 @@
         </w:rPr>
         <w:t>ICML, 2026. [</w:t>
       </w:r>
-      <w:hyperlink r:id="rId21">
+      <w:hyperlink r:id="rId25">
         <w:r>
           <w:rPr>
             <w:rFonts w:ascii="Lato" w:hAnsi="Lato" w:eastAsia="Lato" w:cs="Lato"/>
@@ -2416,7 +2825,7 @@
         </w:rPr>
         <w:t>ICASSP, 2026. [</w:t>
       </w:r>
-      <w:hyperlink r:id="rId22">
+      <w:hyperlink r:id="rId26">
         <w:r>
           <w:rPr>
             <w:rFonts w:ascii="Lato" w:hAnsi="Lato" w:eastAsia="Lato" w:cs="Lato"/>
@@ -2626,7 +3035,7 @@
         </w:rPr>
         <w:t>ICML, 2025. [</w:t>
       </w:r>
-      <w:hyperlink r:id="rId23">
+      <w:hyperlink r:id="rId27">
         <w:r>
           <w:rPr>
             <w:rFonts w:ascii="Lato" w:hAnsi="Lato" w:eastAsia="Lato" w:cs="Lato"/>
@@ -2791,7 +3200,7 @@
         </w:rPr>
         <w:t>NeurIPSW (Time Series in the Age of Large Models) , 2024. [</w:t>
       </w:r>
-      <w:hyperlink r:id="rId24">
+      <w:hyperlink r:id="rId28">
         <w:r>
           <w:rPr>
             <w:rFonts w:ascii="Lato" w:hAnsi="Lato" w:eastAsia="Lato" w:cs="Lato"/>
@@ -2946,7 +3355,7 @@
         </w:rPr>
         <w:t>[</w:t>
       </w:r>
-      <w:hyperlink r:id="rId22">
+      <w:hyperlink r:id="rId26">
         <w:r>
           <w:rPr>
             <w:rFonts w:ascii="Lato" w:hAnsi="Lato" w:eastAsia="Lato" w:cs="Lato"/>
@@ -3079,7 +3488,7 @@
         </w:rPr>
         <w:t>NeurIPS, 2024. [</w:t>
       </w:r>
-      <w:hyperlink r:id="rId25">
+      <w:hyperlink r:id="rId29">
         <w:r>
           <w:rPr>
             <w:rFonts w:ascii="Lato" w:hAnsi="Lato" w:eastAsia="Lato" w:cs="Lato"/>
@@ -3226,7 +3635,7 @@
         </w:rPr>
         <w:t>ICLR, 2024. [</w:t>
       </w:r>
-      <w:hyperlink r:id="rId26">
+      <w:hyperlink r:id="rId30">
         <w:r>
           <w:rPr>
             <w:rFonts w:ascii="Lato" w:hAnsi="Lato" w:eastAsia="Lato" w:cs="Lato"/>
@@ -3376,7 +3785,7 @@
         </w:rPr>
         <w:t>[</w:t>
       </w:r>
-      <w:hyperlink r:id="rId27">
+      <w:hyperlink r:id="rId31">
         <w:r>
           <w:rPr>
             <w:rFonts w:ascii="Lato" w:hAnsi="Lato" w:eastAsia="Lato" w:cs="Lato"/>
@@ -6695,7 +7104,7 @@
         </w:rPr>
         <w:t>1st Semester: Contributed an article on AI in the Arts to IT Chosun (</w:t>
       </w:r>
-      <w:hyperlink r:id="rId28">
+      <w:hyperlink r:id="rId32">
         <w:r>
           <w:rPr>
             <w:rFonts w:ascii="Lato" w:hAnsi="Lato" w:eastAsia="Lato" w:cs="Lato"/>
@@ -12185,8 +12594,8 @@
       </w:r>
     </w:p>
     <w:sectPr>
-      <w:headerReference w:type="default" r:id="rId29"/>
-      <w:footerReference w:type="default" r:id="rId30"/>
+      <w:headerReference w:type="default" r:id="rId33"/>
+      <w:footerReference w:type="default" r:id="rId34"/>
       <w:pgSz w:w="11906" w:h="16838"/>
       <w:pgMar w:top="1020" w:right="964" w:bottom="1020" w:left="1077" w:header="0" w:footer="510" w:gutter="0"/>
       <w:cols w:space="720"/>

</xml_diff>

<commit_message>
Add TMLR 2026 reviewer role; give the CV an Academic Service section
The CV had no reviewer list at all, so section 6 "Academic Service" is new
and sections 6-13 shift to 7-14. Homepage gains a TMLR row. Still 12 pages.

Co-Authored-By: Claude Opus 5 (1M context) <noreply@anthropic.com>
</commit_message>
<xml_diff>
--- a/SeunghanLee_CV.docx
+++ b/SeunghanLee_CV.docx
@@ -6198,7 +6198,7 @@
           <w:sz w:val="29"/>
           <w:u w:val="none"/>
         </w:rPr>
-        <w:t>6. Invited Talks</w:t>
+        <w:t>6. Academic Service</w:t>
       </w:r>
     </w:p>
     <w:p>
@@ -6221,12 +6221,22 @@
       <w:r>
         <w:rPr>
           <w:rFonts w:ascii="Lato" w:hAnsi="Lato" w:eastAsia="Lato" w:cs="Lato"/>
-          <w:b w:val="0"/>
+          <w:b/>
           <w:i w:val="0"/>
           <w:sz w:val="20"/>
           <w:u w:val="none"/>
         </w:rPr>
-        <w:t>2024.08. Korean Artificial Intelligence Association (2024 Summer Conference)</w:t>
+        <w:t>Reviewer</w:t>
+      </w:r>
+      <w:r>
+        <w:rPr>
+          <w:rFonts w:ascii="Lato" w:hAnsi="Lato" w:eastAsia="Lato" w:cs="Lato"/>
+          <w:b w:val="0"/>
+          <w:i w:val="0"/>
+          <w:sz w:val="20"/>
+          <w:u w:val="none"/>
+        </w:rPr>
+        <w:t>: ICLR (2025, 2026), ICML (2024, 2025, 2026), NeurIPS (2024, 2025), EMNLP (2026), TMLR (2026)</w:t>
       </w:r>
     </w:p>
     <w:p>
@@ -6245,7 +6255,54 @@
           <w:sz w:val="29"/>
           <w:u w:val="none"/>
         </w:rPr>
-        <w:t>7. Intellectual Property</w:t>
+        <w:t>7. Invited Talks</w:t>
+      </w:r>
+    </w:p>
+    <w:p>
+      <w:pPr>
+        <w:spacing w:before="0" w:after="0"/>
+        <w:ind w:left="662" w:hanging="331"/>
+      </w:pPr>
+      <w:r>
+        <w:rPr>
+          <w:rFonts w:ascii="Lato" w:hAnsi="Lato" w:eastAsia="Lato" w:cs="Lato"/>
+          <w:b w:val="0"/>
+          <w:i w:val="0"/>
+          <w:color w:val="0F3D57"/>
+          <w:sz w:val="17"/>
+          <w:u w:val="none"/>
+        </w:rPr>
+        <w:t>•</w:t>
+        <w:tab/>
+      </w:r>
+      <w:r>
+        <w:rPr>
+          <w:rFonts w:ascii="Lato" w:hAnsi="Lato" w:eastAsia="Lato" w:cs="Lato"/>
+          <w:b w:val="0"/>
+          <w:i w:val="0"/>
+          <w:sz w:val="20"/>
+          <w:u w:val="none"/>
+        </w:rPr>
+        <w:t>2024.08. Korean Artificial Intelligence Association (2024 Summer Conference)</w:t>
+      </w:r>
+    </w:p>
+    <w:p>
+      <w:pPr>
+        <w:pBdr>
+          <w:bottom w:val="single" w:sz="14" w:space="2" w:color="C4761A"/>
+        </w:pBdr>
+        <w:spacing w:before="440" w:after="120" w:line="240" w:lineRule="auto"/>
+      </w:pPr>
+      <w:r>
+        <w:rPr>
+          <w:rFonts w:ascii="Lato" w:hAnsi="Lato" w:eastAsia="Lato" w:cs="Lato"/>
+          <w:b/>
+          <w:i w:val="0"/>
+          <w:color w:val="0F3D57"/>
+          <w:sz w:val="29"/>
+          <w:u w:val="none"/>
+        </w:rPr>
+        <w:t>8. Intellectual Property</w:t>
       </w:r>
     </w:p>
     <w:p>
@@ -6329,7 +6386,7 @@
           <w:sz w:val="29"/>
           <w:u w:val="none"/>
         </w:rPr>
-        <w:t>8. Programming Languages</w:t>
+        <w:t>9. Programming Languages</w:t>
       </w:r>
     </w:p>
     <w:p>
@@ -6462,7 +6519,7 @@
           <w:sz w:val="29"/>
           <w:u w:val="none"/>
         </w:rPr>
-        <w:t>9. Instructor, Teaching Assistant (TA)</w:t>
+        <w:t>10. Instructor, Teaching Assistant (TA)</w:t>
       </w:r>
     </w:p>
     <w:p>
@@ -6945,7 +7002,7 @@
           <w:sz w:val="29"/>
           <w:u w:val="none"/>
         </w:rPr>
-        <w:t>10. Academic Society &amp; Club</w:t>
+        <w:t>11. Academic Society &amp; Club</w:t>
       </w:r>
     </w:p>
     <w:p>
@@ -8307,7 +8364,7 @@
           <w:sz w:val="29"/>
           <w:u w:val="none"/>
         </w:rPr>
-        <w:t>11. Certifications &amp; Awards</w:t>
+        <w:t>12. Certifications &amp; Awards</w:t>
       </w:r>
     </w:p>
     <w:p>
@@ -10086,7 +10143,7 @@
           <w:sz w:val="29"/>
           <w:u w:val="none"/>
         </w:rPr>
-        <w:t>12. Projects</w:t>
+        <w:t>13. Projects</w:t>
       </w:r>
     </w:p>
     <w:p>
@@ -10580,7 +10637,7 @@
           <w:sz w:val="29"/>
           <w:u w:val="none"/>
         </w:rPr>
-        <w:t>13. Competitions</w:t>
+        <w:t>14. Competitions</w:t>
       </w:r>
     </w:p>
     <w:p>

</xml_diff>